<commit_message>
Assignment 4 - Task 4 done
</commit_message>
<xml_diff>
--- a/4/Assignment_4_documentation.docx
+++ b/4/Assignment_4_documentation.docx
@@ -92,8 +92,13 @@
       <w:pPr>
         <w:pStyle w:val="Cmlapkarstanszk"/>
       </w:pPr>
-      <w:r>
-        <w:t>Systemsicherheit (211011-SS 2026)</w:t>
+      <w:proofErr w:type="spellStart"/>
+      <w:r>
+        <w:t>Systemsicherheit</w:t>
+      </w:r>
+      <w:proofErr w:type="spellEnd"/>
+      <w:r>
+        <w:t xml:space="preserve"> (211011-SS 2026)</w:t>
       </w:r>
     </w:p>
     <w:p/>
@@ -351,75 +356,474 @@
     </w:p>
     <w:p>
       <w:r>
-        <w:t>Using GDB we can</w:t>
-      </w:r>
-      <w:r>
-        <w:t xml:space="preserve"> analy</w:t>
-      </w:r>
-      <w:r>
-        <w:t>ze the assembly code that runs with the crackme program. From the hints we know that the secret key is checked in the verify_key function with the strcmp C function. So, if we are able to get to the data that is compared in that call then we can get the key.</w:t>
+        <w:t>The stack frame is made up of the following contents of memory:</w:t>
       </w:r>
     </w:p>
     <w:p>
-      <w:r>
-        <w:t xml:space="preserve">With </w:t>
-      </w:r>
-      <w:r>
-        <w:t>the “</w:t>
-      </w:r>
-      <w:r>
-        <w:t>info address verify_key</w:t>
-      </w:r>
-      <w:r>
-        <w:t>”</w:t>
-      </w:r>
-      <w:r>
-        <w:t xml:space="preserve"> command we can get the address of the validating function and disassemble it. In the function we found the call that executes strcmp. If we put a breakpoint before the function is called, we can see what values are pushed to the stack.</w:t>
+      <w:pPr>
+        <w:pStyle w:val="ListParagraph"/>
+        <w:numPr>
+          <w:ilvl w:val="0"/>
+          <w:numId w:val="48"/>
+        </w:numPr>
+      </w:pPr>
+      <w:r>
+        <w:t>Parameters: In this case the pointer to the password string.</w:t>
       </w:r>
     </w:p>
     <w:p>
-      <w:r>
-        <w:t xml:space="preserve">When we now run the program with a sample input AAAAA it breaks before entering the call. Here we see the exact address of the secret key. </w:t>
-      </w:r>
-      <w:r>
-        <w:t>With the “x/s 0xaddr” command we see that the value is “MMNNQ”. However, if give the program this input it still says that the key is not valid.</w:t>
+      <w:pPr>
+        <w:pStyle w:val="ListParagraph"/>
+        <w:numPr>
+          <w:ilvl w:val="0"/>
+          <w:numId w:val="48"/>
+        </w:numPr>
+      </w:pPr>
+      <w:r>
+        <w:t>Return Address: Where the main function will continue after the call is finished.</w:t>
       </w:r>
     </w:p>
     <w:p>
-      <w:r>
-        <w:t xml:space="preserve">The reasoning for that can be seen in the verify_key function. Before calling the strcmp function the input goes through a loop. Each </w:t>
-      </w:r>
-      <w:r>
-        <w:t>character in the input is subtracted by their index in the string times two. When we add these to “MMNNQ” and look at the ASCII values we get the key “MORTY”. This key is validated by the program.</w:t>
-      </w:r>
-      <w:r>
-        <w:t xml:space="preserve"> </w:t>
+      <w:pPr>
+        <w:pStyle w:val="ListParagraph"/>
+        <w:numPr>
+          <w:ilvl w:val="0"/>
+          <w:numId w:val="48"/>
+        </w:numPr>
+      </w:pPr>
+      <w:r>
+        <w:t>Stack frame pointer: Points to the base address of the stack frame.</w:t>
       </w:r>
     </w:p>
     <w:p>
       <w:pPr>
-        <w:pStyle w:val="Heading2"/>
-      </w:pPr>
-      <w:r>
-        <w:t>Analysis</w:t>
+        <w:pStyle w:val="ListParagraph"/>
+        <w:numPr>
+          <w:ilvl w:val="0"/>
+          <w:numId w:val="48"/>
+        </w:numPr>
+      </w:pPr>
+      <w:r>
+        <w:t>Local variables: All the variables that are declared and used only in this function.</w:t>
       </w:r>
     </w:p>
     <w:p>
       <w:r>
-        <w:t xml:space="preserve">In order to reconstruct the code, we have to dissemble the main function as well. We can see that there is no other function call in it. </w:t>
-      </w:r>
-      <w:r>
-        <w:t>The rest of the code simply reads the input, calls the verify_key function and writes the message based on the result of it.</w:t>
+        <w:t xml:space="preserve">Based on this knowledge we can fill out the stack frame and label the contents appropriately. The one and only parameter of the function is the pointer to the input string. On the other hand, there are two local variables: </w:t>
+      </w:r>
+      <w:proofErr w:type="spellStart"/>
+      <w:r>
+        <w:t>auth_flag</w:t>
+      </w:r>
+      <w:proofErr w:type="spellEnd"/>
+      <w:r>
+        <w:t xml:space="preserve"> and </w:t>
+      </w:r>
+      <w:proofErr w:type="spellStart"/>
+      <w:r>
+        <w:t>password_buffer</w:t>
+      </w:r>
+      <w:proofErr w:type="spellEnd"/>
+      <w:r>
+        <w:t xml:space="preserve">. The first one is an integer used to determine the outcome of the function. While the other variable is a </w:t>
+      </w:r>
+      <w:r>
+        <w:t>12-byte</w:t>
+      </w:r>
+      <w:r>
+        <w:t xml:space="preserve"> long array used for storing the password for the </w:t>
+      </w:r>
+      <w:proofErr w:type="spellStart"/>
+      <w:r>
+        <w:t>strcpy</w:t>
+      </w:r>
+      <w:proofErr w:type="spellEnd"/>
+      <w:r>
+        <w:t>() function.</w:t>
       </w:r>
     </w:p>
-    <w:bookmarkStart w:id="0" w:name="_MON_1842895867"/>
+    <w:p>
+      <w:pPr>
+        <w:pStyle w:val="Picture"/>
+      </w:pPr>
+      <w:r>
+        <w:lastRenderedPageBreak/>
+        <w:drawing>
+          <wp:inline distT="0" distB="0" distL="0" distR="0" wp14:anchorId="0D6D9F7A" wp14:editId="700491EE">
+            <wp:extent cx="5400040" cy="5572760"/>
+            <wp:effectExtent l="0" t="0" r="0" b="8890"/>
+            <wp:docPr id="883930030" name="Picture 1"/>
+            <wp:cNvGraphicFramePr>
+              <a:graphicFrameLocks xmlns:a="http://schemas.openxmlformats.org/drawingml/2006/main" noChangeAspect="1"/>
+            </wp:cNvGraphicFramePr>
+            <a:graphic xmlns:a="http://schemas.openxmlformats.org/drawingml/2006/main">
+              <a:graphicData uri="http://schemas.openxmlformats.org/drawingml/2006/picture">
+                <pic:pic xmlns:pic="http://schemas.openxmlformats.org/drawingml/2006/picture">
+                  <pic:nvPicPr>
+                    <pic:cNvPr id="883930030" name=""/>
+                    <pic:cNvPicPr/>
+                  </pic:nvPicPr>
+                  <pic:blipFill>
+                    <a:blip r:embed="rId12"/>
+                    <a:stretch>
+                      <a:fillRect/>
+                    </a:stretch>
+                  </pic:blipFill>
+                  <pic:spPr>
+                    <a:xfrm>
+                      <a:off x="0" y="0"/>
+                      <a:ext cx="5400040" cy="5572760"/>
+                    </a:xfrm>
+                    <a:prstGeom prst="rect">
+                      <a:avLst/>
+                    </a:prstGeom>
+                  </pic:spPr>
+                </pic:pic>
+              </a:graphicData>
+            </a:graphic>
+          </wp:inline>
+        </w:drawing>
+      </w:r>
+    </w:p>
+    <w:p>
+      <w:r>
+        <w:t xml:space="preserve">The attack in this task is a simple buffer overflow attack. Because the program uses the unsafe </w:t>
+      </w:r>
+      <w:proofErr w:type="spellStart"/>
+      <w:r>
+        <w:t>strcpy</w:t>
+      </w:r>
+      <w:proofErr w:type="spellEnd"/>
+      <w:r>
+        <w:t xml:space="preserve">() function the attacker is able to alter the </w:t>
+      </w:r>
+      <w:proofErr w:type="spellStart"/>
+      <w:r>
+        <w:t>auth_flag</w:t>
+      </w:r>
+      <w:proofErr w:type="spellEnd"/>
+      <w:r>
+        <w:t xml:space="preserve"> variable by giving an input that is longer than 12 bytes. Let’s say that the input password is twelve 0xAA characters plus 0x01 at the end. When this code runs the twelve 0xAA characters are stored in the buffer, but 0x01 overflows to the </w:t>
+      </w:r>
+      <w:proofErr w:type="spellStart"/>
+      <w:r>
+        <w:t>auth_flag</w:t>
+      </w:r>
+      <w:proofErr w:type="spellEnd"/>
+      <w:r>
+        <w:t xml:space="preserve"> integer. The </w:t>
+      </w:r>
+      <w:proofErr w:type="spellStart"/>
+      <w:r>
+        <w:t>strcmp</w:t>
+      </w:r>
+      <w:proofErr w:type="spellEnd"/>
+      <w:r>
+        <w:t xml:space="preserve">() comparison fails, so in theory </w:t>
+      </w:r>
+      <w:proofErr w:type="spellStart"/>
+      <w:r>
+        <w:t>auth_flag</w:t>
+      </w:r>
+      <w:proofErr w:type="spellEnd"/>
+      <w:r>
+        <w:t xml:space="preserve"> is not set to 1, but with this attack its value has been 0x01 since the </w:t>
+      </w:r>
+      <w:proofErr w:type="spellStart"/>
+      <w:r>
+        <w:t>strcpy</w:t>
+      </w:r>
+      <w:proofErr w:type="spellEnd"/>
+      <w:r>
+        <w:t>() function.</w:t>
+      </w:r>
+    </w:p>
+    <w:p>
+      <w:pPr>
+        <w:pStyle w:val="Heading2"/>
+      </w:pPr>
+      <w:r>
+        <w:t>Analysis</w:t>
+      </w:r>
+    </w:p>
+    <w:p>
+      <w:pPr>
+        <w:rPr>
+          <w:noProof/>
+        </w:rPr>
+      </w:pPr>
+      <w:r>
+        <w:t xml:space="preserve">In order to </w:t>
+      </w:r>
+      <w:r>
+        <w:t>analyze</w:t>
+      </w:r>
+      <w:r>
+        <w:t xml:space="preserve"> the </w:t>
+      </w:r>
+      <w:r>
+        <w:t>new hardened version</w:t>
+      </w:r>
+      <w:r>
+        <w:t xml:space="preserve">, we have to </w:t>
+      </w:r>
+      <w:r>
+        <w:t>see what changed in</w:t>
+      </w:r>
+      <w:r>
+        <w:t xml:space="preserve"> </w:t>
+      </w:r>
+      <w:r>
+        <w:t xml:space="preserve">the </w:t>
+      </w:r>
+      <w:proofErr w:type="spellStart"/>
+      <w:r>
+        <w:t>check_authentication</w:t>
+      </w:r>
+      <w:proofErr w:type="spellEnd"/>
+      <w:r>
+        <w:t xml:space="preserve"> </w:t>
+      </w:r>
+      <w:r>
+        <w:t>function</w:t>
+      </w:r>
+      <w:r>
+        <w:t xml:space="preserve">. Using GDB we can find the function with “info functions” and </w:t>
+      </w:r>
+      <w:r>
+        <w:t>disassemble</w:t>
+      </w:r>
+      <w:r>
+        <w:t xml:space="preserve"> it to see the assembly code.</w:t>
+      </w:r>
+      <w:r>
+        <w:t xml:space="preserve"> Here it is:</w:t>
+      </w:r>
+    </w:p>
+    <w:p>
+      <w:pPr>
+        <w:pStyle w:val="Picture"/>
+      </w:pPr>
+      <w:r>
+        <w:lastRenderedPageBreak/>
+        <w:drawing>
+          <wp:inline distT="0" distB="0" distL="0" distR="0" wp14:anchorId="13B4A149" wp14:editId="137067D1">
+            <wp:extent cx="5400040" cy="7315200"/>
+            <wp:effectExtent l="0" t="0" r="0" b="0"/>
+            <wp:docPr id="331524022" name="Picture 1"/>
+            <wp:cNvGraphicFramePr>
+              <a:graphicFrameLocks xmlns:a="http://schemas.openxmlformats.org/drawingml/2006/main" noChangeAspect="1"/>
+            </wp:cNvGraphicFramePr>
+            <a:graphic xmlns:a="http://schemas.openxmlformats.org/drawingml/2006/main">
+              <a:graphicData uri="http://schemas.openxmlformats.org/drawingml/2006/picture">
+                <pic:pic xmlns:pic="http://schemas.openxmlformats.org/drawingml/2006/picture">
+                  <pic:nvPicPr>
+                    <pic:cNvPr id="331524022" name=""/>
+                    <pic:cNvPicPr/>
+                  </pic:nvPicPr>
+                  <pic:blipFill>
+                    <a:blip r:embed="rId13"/>
+                    <a:stretch>
+                      <a:fillRect/>
+                    </a:stretch>
+                  </pic:blipFill>
+                  <pic:spPr>
+                    <a:xfrm>
+                      <a:off x="0" y="0"/>
+                      <a:ext cx="5400040" cy="7315200"/>
+                    </a:xfrm>
+                    <a:prstGeom prst="rect">
+                      <a:avLst/>
+                    </a:prstGeom>
+                  </pic:spPr>
+                </pic:pic>
+              </a:graphicData>
+            </a:graphic>
+          </wp:inline>
+        </w:drawing>
+      </w:r>
+    </w:p>
+    <w:p>
+      <w:r>
+        <w:t xml:space="preserve">What we can </w:t>
+      </w:r>
+      <w:r>
+        <w:t>deduct</w:t>
+      </w:r>
+      <w:r>
+        <w:t xml:space="preserve"> from this code is that instead of using a simple integer for storing </w:t>
+      </w:r>
+      <w:proofErr w:type="spellStart"/>
+      <w:r>
+        <w:t>auth_flag</w:t>
+      </w:r>
+      <w:proofErr w:type="spellEnd"/>
+      <w:r>
+        <w:t xml:space="preserve"> the function now uses three bytes that are set to a specific value. These are</w:t>
+      </w:r>
+      <w:r>
+        <w:t xml:space="preserve"> 0x21, 0x6k and 0x4f. If any of these differ then the function returns a false value.</w:t>
+      </w:r>
+    </w:p>
+    <w:p>
+      <w:r>
+        <w:t xml:space="preserve">Now to carry out our attack we need to set these 3 bytes to the correct values. For that we need to find the address of the buffer and the authenticating bytes as well. The </w:t>
+      </w:r>
+      <w:proofErr w:type="spellStart"/>
+      <w:r>
+        <w:lastRenderedPageBreak/>
+        <w:t>strcpy</w:t>
+      </w:r>
+      <w:proofErr w:type="spellEnd"/>
+      <w:r>
+        <w:t xml:space="preserve"> function stores its return value in ebp</w:t>
+      </w:r>
+      <w:r>
+        <w:t xml:space="preserve">-0x17 and the bytes that are compared are ebp-0x9, </w:t>
+      </w:r>
+      <w:r>
+        <w:t>ebp-0x</w:t>
+      </w:r>
+      <w:r>
+        <w:t xml:space="preserve">a and </w:t>
+      </w:r>
+      <w:r>
+        <w:t>ebp-0x</w:t>
+      </w:r>
+      <w:r>
+        <w:t>b. The difference between these addresses are 14, 13 and 12 bytes. Thus, the variables are most likely stored the same way. So, after the twelve padding A characters adding 0x4f 0x6b and 0x21 should result in a break.</w:t>
+      </w:r>
+    </w:p>
+    <w:p>
+      <w:r>
+        <w:t>Writing this string (</w:t>
+      </w:r>
+      <w:r>
+        <w:t>"AAAAAAAAAAAA\x4f\x6b\x21"</w:t>
+      </w:r>
+      <w:r>
+        <w:t xml:space="preserve">) directly as an argument to the </w:t>
+      </w:r>
+      <w:proofErr w:type="spellStart"/>
+      <w:r>
+        <w:t>doa</w:t>
+      </w:r>
+      <w:proofErr w:type="spellEnd"/>
+      <w:r>
+        <w:t xml:space="preserve"> program results in a segmentation fault. That is why we use solution.txt to store our input and use </w:t>
+      </w:r>
+      <w:r>
+        <w:t>"$(cat solution.txt)"</w:t>
+      </w:r>
+      <w:r>
+        <w:t xml:space="preserve"> to copy its values to the input, preventing the segmentation fault. </w:t>
+      </w:r>
+      <w:r>
+        <w:t xml:space="preserve">In the text file we can also see that the value of the authenticating bytes </w:t>
+      </w:r>
+      <w:r>
+        <w:t>is</w:t>
+      </w:r>
+      <w:r>
+        <w:t xml:space="preserve"> simply “Ok!”.</w:t>
+      </w:r>
+    </w:p>
+    <w:p>
+      <w:pPr>
+        <w:pStyle w:val="Heading1"/>
+      </w:pPr>
+      <w:proofErr w:type="spellStart"/>
+      <w:r>
+        <w:rPr>
+          <w:lang w:val="hu-HU"/>
+        </w:rPr>
+        <w:lastRenderedPageBreak/>
+        <w:t>Stack-based</w:t>
+      </w:r>
+      <w:proofErr w:type="spellEnd"/>
+      <w:r>
+        <w:rPr>
+          <w:lang w:val="hu-HU"/>
+        </w:rPr>
+        <w:t xml:space="preserve"> </w:t>
+      </w:r>
+      <w:proofErr w:type="spellStart"/>
+      <w:r>
+        <w:rPr>
+          <w:lang w:val="hu-HU"/>
+        </w:rPr>
+        <w:t>Buffer</w:t>
+      </w:r>
+      <w:proofErr w:type="spellEnd"/>
+      <w:r>
+        <w:rPr>
+          <w:lang w:val="hu-HU"/>
+        </w:rPr>
+        <w:t xml:space="preserve"> Overflow</w:t>
+      </w:r>
+    </w:p>
+    <w:p>
+      <w:r>
+        <w:t>These tasks introduce the use of system calls and how this high-level concept can be exploited with binaries.</w:t>
+      </w:r>
+    </w:p>
+    <w:p>
+      <w:pPr>
+        <w:pStyle w:val="Heading2"/>
+        <w:rPr>
+          <w:lang w:val="hu-HU"/>
+        </w:rPr>
+      </w:pPr>
+      <w:r>
+        <w:rPr>
+          <w:lang w:val="hu-HU"/>
+        </w:rPr>
+        <w:t xml:space="preserve">Simple </w:t>
+      </w:r>
+      <w:proofErr w:type="spellStart"/>
+      <w:r>
+        <w:rPr>
+          <w:lang w:val="hu-HU"/>
+        </w:rPr>
+        <w:t>Buffer</w:t>
+      </w:r>
+      <w:proofErr w:type="spellEnd"/>
+      <w:r>
+        <w:rPr>
+          <w:lang w:val="hu-HU"/>
+        </w:rPr>
+        <w:t xml:space="preserve"> Overflow</w:t>
+      </w:r>
+    </w:p>
+    <w:p>
+      <w:r>
+        <w:t xml:space="preserve">The assembly code can be written based on the Linux </w:t>
+      </w:r>
+      <w:proofErr w:type="spellStart"/>
+      <w:r>
+        <w:t>syscalls</w:t>
+      </w:r>
+      <w:proofErr w:type="spellEnd"/>
+      <w:r>
+        <w:t xml:space="preserve"> list and each calls manual. To write a message to a file we first need to open or create that file. Then we need to write the message into it. Save it by closing it and then exit the program. These steps can be written in with a </w:t>
+      </w:r>
+      <w:proofErr w:type="spellStart"/>
+      <w:r>
+        <w:t>syscall</w:t>
+      </w:r>
+      <w:proofErr w:type="spellEnd"/>
+      <w:r>
+        <w:t xml:space="preserve"> each.</w:t>
+      </w:r>
+    </w:p>
+    <w:bookmarkStart w:id="0" w:name="_MON_1842900161"/>
     <w:bookmarkEnd w:id="0"/>
     <w:p>
       <w:pPr>
         <w:pStyle w:val="Picture"/>
       </w:pPr>
       <w:r>
-        <w:object w:dxaOrig="9072" w:dyaOrig="13618" w14:anchorId="0194EBDD">
+        <w:object w:dxaOrig="9072" w:dyaOrig="11609" w14:anchorId="7C44F73B">
           <v:shapetype id="_x0000_t75" coordsize="21600,21600" o:spt="75" o:preferrelative="t" path="m@4@5l@4@11@9@11@9@5xe" filled="f" stroked="f">
             <v:stroke joinstyle="miter"/>
             <v:formulas>
@@ -439,10 +843,10 @@
             <v:path o:extrusionok="f" gradientshapeok="t" o:connecttype="rect"/>
             <o:lock v:ext="edit" aspectratio="t"/>
           </v:shapetype>
-          <v:shape id="_x0000_i1025" type="#_x0000_t75" style="width:453.75pt;height:681pt" o:ole="">
-            <v:imagedata r:id="rId12" o:title=""/>
+          <v:shape id="_x0000_i1026" type="#_x0000_t75" style="width:453.75pt;height:580.5pt" o:ole="">
+            <v:imagedata r:id="rId14" o:title=""/>
           </v:shape>
-          <o:OLEObject Type="Embed" ProgID="Word.Document.12" ShapeID="_x0000_i1025" DrawAspect="Content" ObjectID="_1843809340" r:id="rId13">
+          <o:OLEObject Type="Embed" ProgID="Word.Document.12" ShapeID="_x0000_i1026" DrawAspect="Content" ObjectID="_1843838282" r:id="rId15">
             <o:FieldCodes>\s</o:FieldCodes>
           </o:OLEObject>
         </w:object>
@@ -450,87 +854,74 @@
     </w:p>
     <w:p>
       <w:pPr>
-        <w:pStyle w:val="Heading1"/>
+        <w:pStyle w:val="Heading2"/>
       </w:pPr>
       <w:r>
         <w:rPr>
           <w:lang w:val="hu-HU"/>
         </w:rPr>
-        <w:lastRenderedPageBreak/>
-        <w:t>Stack-based Buffer Overflow</w:t>
-      </w:r>
-    </w:p>
-    <w:p>
-      <w:r>
-        <w:t>These tasks introduce the use of system calls and how this high-level concept can be exploited with binaries.</w:t>
-      </w:r>
-    </w:p>
-    <w:p>
-      <w:pPr>
-        <w:pStyle w:val="Heading2"/>
+        <w:t xml:space="preserve">NOP </w:t>
+      </w:r>
+      <w:proofErr w:type="spellStart"/>
+      <w:r>
         <w:rPr>
           <w:lang w:val="hu-HU"/>
         </w:rPr>
-      </w:pPr>
-      <w:r>
-        <w:rPr>
-          <w:lang w:val="hu-HU"/>
-        </w:rPr>
-        <w:t>Simple Buffer Overflow</w:t>
-      </w:r>
+        <w:t>Sliding</w:t>
+      </w:r>
+      <w:proofErr w:type="spellEnd"/>
     </w:p>
     <w:p>
       <w:r>
-        <w:t>The assembly code can be written based on the Linux syscalls list and each calls manual. To write a message to a file we first need to open or create that file. Then we need to write the message into it. Save it by closing it and then exit the program. These steps can be written in with a syscall each.</w:t>
-      </w:r>
-    </w:p>
-    <w:bookmarkStart w:id="1" w:name="_MON_1842900161"/>
-    <w:bookmarkEnd w:id="1"/>
-    <w:p>
-      <w:pPr>
-        <w:pStyle w:val="Picture"/>
-      </w:pPr>
-      <w:r>
-        <w:object w:dxaOrig="9072" w:dyaOrig="11609" w14:anchorId="7C44F73B">
-          <v:shape id="_x0000_i1026" type="#_x0000_t75" style="width:453.75pt;height:580.5pt" o:ole="">
-            <v:imagedata r:id="rId14" o:title=""/>
-          </v:shape>
-          <o:OLEObject Type="Embed" ProgID="Word.Document.12" ShapeID="_x0000_i1026" DrawAspect="Content" ObjectID="_1843809341" r:id="rId15">
-            <o:FieldCodes>\s</o:FieldCodes>
-          </o:OLEObject>
-        </w:object>
+        <w:t xml:space="preserve">The main difference between the previous task and this one is that the shell code cannot have null bytes in it as that would result in the termination of the process. The trick is to push the null bytes onto the stack and form the strings and the pointers directly </w:t>
+      </w:r>
+      <w:r>
+        <w:t>onto</w:t>
+      </w:r>
+      <w:r>
+        <w:t xml:space="preserve"> the stack instead of in the operation.</w:t>
       </w:r>
     </w:p>
     <w:p>
-      <w:pPr>
-        <w:pStyle w:val="Heading2"/>
-      </w:pPr>
-      <w:r>
-        <w:rPr>
-          <w:lang w:val="hu-HU"/>
-        </w:rPr>
-        <w:t>NOP Sliding</w:t>
+      <w:r>
+        <w:lastRenderedPageBreak/>
+        <w:t xml:space="preserve">In the task we take a look at the Linux </w:t>
+      </w:r>
+      <w:proofErr w:type="spellStart"/>
+      <w:r>
+        <w:t>syscall</w:t>
+      </w:r>
+      <w:proofErr w:type="spellEnd"/>
+      <w:r>
+        <w:t xml:space="preserve"> list and set the registers based on the </w:t>
+      </w:r>
+      <w:proofErr w:type="spellStart"/>
+      <w:r>
+        <w:t>execve</w:t>
+      </w:r>
+      <w:proofErr w:type="spellEnd"/>
+      <w:r>
+        <w:t xml:space="preserve"> call. We push the filename string, the </w:t>
+      </w:r>
+      <w:proofErr w:type="spellStart"/>
+      <w:r>
+        <w:t>argv</w:t>
+      </w:r>
+      <w:proofErr w:type="spellEnd"/>
+      <w:r>
+        <w:t xml:space="preserve"> array and the </w:t>
+      </w:r>
+      <w:proofErr w:type="spellStart"/>
+      <w:r>
+        <w:t>envp</w:t>
+      </w:r>
+      <w:proofErr w:type="spellEnd"/>
+      <w:r>
+        <w:t xml:space="preserve"> parameters to the stack and call the kernel.</w:t>
       </w:r>
     </w:p>
-    <w:p>
-      <w:r>
-        <w:t xml:space="preserve">The main difference between the previous task and this one is that the shell code cannot have null bytes in it as that would result in the termination of the process. The trick is to push the null bytes onto the stack and form the strings and the pointers directly </w:t>
-      </w:r>
-      <w:r>
-        <w:t>onto</w:t>
-      </w:r>
-      <w:r>
-        <w:t xml:space="preserve"> the stack instead of in the operation.</w:t>
-      </w:r>
-    </w:p>
-    <w:p>
-      <w:r>
-        <w:lastRenderedPageBreak/>
-        <w:t>In the task we take a look at the Linux syscall list and set the registers based on the execve call. We push the filename string, the argv array and the envp parameters to the stack and call the kernel.</w:t>
-      </w:r>
-    </w:p>
-    <w:bookmarkStart w:id="2" w:name="_MON_1842944174"/>
-    <w:bookmarkEnd w:id="2"/>
+    <w:bookmarkStart w:id="1" w:name="_MON_1842944174"/>
+    <w:bookmarkEnd w:id="1"/>
     <w:p>
       <w:pPr>
         <w:pStyle w:val="Picture"/>
@@ -540,7 +931,7 @@
           <v:shape id="_x0000_i1027" type="#_x0000_t75" style="width:453.75pt;height:433.5pt" o:ole="">
             <v:imagedata r:id="rId16" o:title=""/>
           </v:shape>
-          <o:OLEObject Type="Embed" ProgID="Word.Document.12" ShapeID="_x0000_i1027" DrawAspect="Content" ObjectID="_1843809342" r:id="rId17">
+          <o:OLEObject Type="Embed" ProgID="Word.Document.12" ShapeID="_x0000_i1027" DrawAspect="Content" ObjectID="_1843838283" r:id="rId17">
             <o:FieldCodes>\s</o:FieldCodes>
           </o:OLEObject>
         </w:object>
@@ -4078,6 +4469,119 @@
     </w:lvl>
   </w:abstractNum>
   <w:abstractNum w:abstractNumId="37" w15:restartNumberingAfterBreak="0">
+    <w:nsid w:val="501617ED"/>
+    <w:multiLevelType w:val="hybridMultilevel"/>
+    <w:tmpl w:val="3160875E"/>
+    <w:lvl w:ilvl="0" w:tplc="040E0001">
+      <w:start w:val="1"/>
+      <w:numFmt w:val="bullet"/>
+      <w:lvlText w:val=""/>
+      <w:lvlJc w:val="left"/>
+      <w:pPr>
+        <w:ind w:left="1500" w:hanging="360"/>
+      </w:pPr>
+      <w:rPr>
+        <w:rFonts w:ascii="Symbol" w:hAnsi="Symbol" w:hint="default"/>
+      </w:rPr>
+    </w:lvl>
+    <w:lvl w:ilvl="1" w:tplc="040E0003" w:tentative="1">
+      <w:start w:val="1"/>
+      <w:numFmt w:val="bullet"/>
+      <w:lvlText w:val="o"/>
+      <w:lvlJc w:val="left"/>
+      <w:pPr>
+        <w:ind w:left="2220" w:hanging="360"/>
+      </w:pPr>
+      <w:rPr>
+        <w:rFonts w:ascii="Courier New" w:hAnsi="Courier New" w:cs="Courier New" w:hint="default"/>
+      </w:rPr>
+    </w:lvl>
+    <w:lvl w:ilvl="2" w:tplc="040E0005" w:tentative="1">
+      <w:start w:val="1"/>
+      <w:numFmt w:val="bullet"/>
+      <w:lvlText w:val=""/>
+      <w:lvlJc w:val="left"/>
+      <w:pPr>
+        <w:ind w:left="2940" w:hanging="360"/>
+      </w:pPr>
+      <w:rPr>
+        <w:rFonts w:ascii="Wingdings" w:hAnsi="Wingdings" w:hint="default"/>
+      </w:rPr>
+    </w:lvl>
+    <w:lvl w:ilvl="3" w:tplc="040E0001" w:tentative="1">
+      <w:start w:val="1"/>
+      <w:numFmt w:val="bullet"/>
+      <w:lvlText w:val=""/>
+      <w:lvlJc w:val="left"/>
+      <w:pPr>
+        <w:ind w:left="3660" w:hanging="360"/>
+      </w:pPr>
+      <w:rPr>
+        <w:rFonts w:ascii="Symbol" w:hAnsi="Symbol" w:hint="default"/>
+      </w:rPr>
+    </w:lvl>
+    <w:lvl w:ilvl="4" w:tplc="040E0003" w:tentative="1">
+      <w:start w:val="1"/>
+      <w:numFmt w:val="bullet"/>
+      <w:lvlText w:val="o"/>
+      <w:lvlJc w:val="left"/>
+      <w:pPr>
+        <w:ind w:left="4380" w:hanging="360"/>
+      </w:pPr>
+      <w:rPr>
+        <w:rFonts w:ascii="Courier New" w:hAnsi="Courier New" w:cs="Courier New" w:hint="default"/>
+      </w:rPr>
+    </w:lvl>
+    <w:lvl w:ilvl="5" w:tplc="040E0005" w:tentative="1">
+      <w:start w:val="1"/>
+      <w:numFmt w:val="bullet"/>
+      <w:lvlText w:val=""/>
+      <w:lvlJc w:val="left"/>
+      <w:pPr>
+        <w:ind w:left="5100" w:hanging="360"/>
+      </w:pPr>
+      <w:rPr>
+        <w:rFonts w:ascii="Wingdings" w:hAnsi="Wingdings" w:hint="default"/>
+      </w:rPr>
+    </w:lvl>
+    <w:lvl w:ilvl="6" w:tplc="040E0001" w:tentative="1">
+      <w:start w:val="1"/>
+      <w:numFmt w:val="bullet"/>
+      <w:lvlText w:val=""/>
+      <w:lvlJc w:val="left"/>
+      <w:pPr>
+        <w:ind w:left="5820" w:hanging="360"/>
+      </w:pPr>
+      <w:rPr>
+        <w:rFonts w:ascii="Symbol" w:hAnsi="Symbol" w:hint="default"/>
+      </w:rPr>
+    </w:lvl>
+    <w:lvl w:ilvl="7" w:tplc="040E0003" w:tentative="1">
+      <w:start w:val="1"/>
+      <w:numFmt w:val="bullet"/>
+      <w:lvlText w:val="o"/>
+      <w:lvlJc w:val="left"/>
+      <w:pPr>
+        <w:ind w:left="6540" w:hanging="360"/>
+      </w:pPr>
+      <w:rPr>
+        <w:rFonts w:ascii="Courier New" w:hAnsi="Courier New" w:cs="Courier New" w:hint="default"/>
+      </w:rPr>
+    </w:lvl>
+    <w:lvl w:ilvl="8" w:tplc="040E0005" w:tentative="1">
+      <w:start w:val="1"/>
+      <w:numFmt w:val="bullet"/>
+      <w:lvlText w:val=""/>
+      <w:lvlJc w:val="left"/>
+      <w:pPr>
+        <w:ind w:left="7260" w:hanging="360"/>
+      </w:pPr>
+      <w:rPr>
+        <w:rFonts w:ascii="Wingdings" w:hAnsi="Wingdings" w:hint="default"/>
+      </w:rPr>
+    </w:lvl>
+  </w:abstractNum>
+  <w:abstractNum w:abstractNumId="38" w15:restartNumberingAfterBreak="0">
     <w:nsid w:val="53535320"/>
     <w:multiLevelType w:val="multilevel"/>
     <w:tmpl w:val="907A15EC"/>
@@ -4221,7 +4725,7 @@
       </w:rPr>
     </w:lvl>
   </w:abstractNum>
-  <w:abstractNum w:abstractNumId="38" w15:restartNumberingAfterBreak="0">
+  <w:abstractNum w:abstractNumId="39" w15:restartNumberingAfterBreak="0">
     <w:nsid w:val="568036F6"/>
     <w:multiLevelType w:val="hybridMultilevel"/>
     <w:tmpl w:val="99E20974"/>
@@ -4307,7 +4811,7 @@
       </w:pPr>
     </w:lvl>
   </w:abstractNum>
-  <w:abstractNum w:abstractNumId="39" w15:restartNumberingAfterBreak="0">
+  <w:abstractNum w:abstractNumId="40" w15:restartNumberingAfterBreak="0">
     <w:nsid w:val="57C90967"/>
     <w:multiLevelType w:val="hybridMultilevel"/>
     <w:tmpl w:val="DBCE00B6"/>
@@ -4420,7 +4924,7 @@
       </w:rPr>
     </w:lvl>
   </w:abstractNum>
-  <w:abstractNum w:abstractNumId="40" w15:restartNumberingAfterBreak="0">
+  <w:abstractNum w:abstractNumId="41" w15:restartNumberingAfterBreak="0">
     <w:nsid w:val="5BAF0AEF"/>
     <w:multiLevelType w:val="hybridMultilevel"/>
     <w:tmpl w:val="2A8ED9AE"/>
@@ -4533,7 +5037,7 @@
       </w:rPr>
     </w:lvl>
   </w:abstractNum>
-  <w:abstractNum w:abstractNumId="41" w15:restartNumberingAfterBreak="0">
+  <w:abstractNum w:abstractNumId="42" w15:restartNumberingAfterBreak="0">
     <w:nsid w:val="652748B7"/>
     <w:multiLevelType w:val="hybridMultilevel"/>
     <w:tmpl w:val="EB6C336C"/>
@@ -4646,7 +5150,7 @@
       </w:rPr>
     </w:lvl>
   </w:abstractNum>
-  <w:abstractNum w:abstractNumId="42" w15:restartNumberingAfterBreak="0">
+  <w:abstractNum w:abstractNumId="43" w15:restartNumberingAfterBreak="0">
     <w:nsid w:val="66FA5888"/>
     <w:multiLevelType w:val="multilevel"/>
     <w:tmpl w:val="670A6AA6"/>
@@ -4795,7 +5299,7 @@
       </w:rPr>
     </w:lvl>
   </w:abstractNum>
-  <w:abstractNum w:abstractNumId="43" w15:restartNumberingAfterBreak="0">
+  <w:abstractNum w:abstractNumId="44" w15:restartNumberingAfterBreak="0">
     <w:nsid w:val="6AFC1994"/>
     <w:multiLevelType w:val="multilevel"/>
     <w:tmpl w:val="907A15EC"/>
@@ -4938,7 +5442,7 @@
       </w:rPr>
     </w:lvl>
   </w:abstractNum>
-  <w:abstractNum w:abstractNumId="44" w15:restartNumberingAfterBreak="0">
+  <w:abstractNum w:abstractNumId="45" w15:restartNumberingAfterBreak="0">
     <w:nsid w:val="799C3B84"/>
     <w:multiLevelType w:val="multilevel"/>
     <w:tmpl w:val="B282A376"/>
@@ -5079,7 +5583,7 @@
       </w:rPr>
     </w:lvl>
   </w:abstractNum>
-  <w:abstractNum w:abstractNumId="45" w15:restartNumberingAfterBreak="0">
+  <w:abstractNum w:abstractNumId="46" w15:restartNumberingAfterBreak="0">
     <w:nsid w:val="7CE6451A"/>
     <w:multiLevelType w:val="multilevel"/>
     <w:tmpl w:val="907A15EC"/>
@@ -5222,7 +5726,7 @@
       </w:rPr>
     </w:lvl>
   </w:abstractNum>
-  <w:abstractNum w:abstractNumId="46" w15:restartNumberingAfterBreak="0">
+  <w:abstractNum w:abstractNumId="47" w15:restartNumberingAfterBreak="0">
     <w:nsid w:val="7E3928A4"/>
     <w:multiLevelType w:val="multilevel"/>
     <w:tmpl w:val="BEBCDEBA"/>
@@ -5375,7 +5879,7 @@
     <w:abstractNumId w:val="10"/>
   </w:num>
   <w:num w:numId="2" w16cid:durableId="450708503">
-    <w:abstractNumId w:val="44"/>
+    <w:abstractNumId w:val="45"/>
   </w:num>
   <w:num w:numId="3" w16cid:durableId="1502551659">
     <w:abstractNumId w:val="17"/>
@@ -5387,7 +5891,7 @@
     <w:abstractNumId w:val="35"/>
   </w:num>
   <w:num w:numId="6" w16cid:durableId="1150249406">
-    <w:abstractNumId w:val="37"/>
+    <w:abstractNumId w:val="38"/>
   </w:num>
   <w:num w:numId="7" w16cid:durableId="1500194679">
     <w:abstractNumId w:val="24"/>
@@ -5399,13 +5903,13 @@
     <w:abstractNumId w:val="26"/>
   </w:num>
   <w:num w:numId="10" w16cid:durableId="663553511">
-    <w:abstractNumId w:val="45"/>
+    <w:abstractNumId w:val="46"/>
   </w:num>
   <w:num w:numId="11" w16cid:durableId="1331561902">
     <w:abstractNumId w:val="27"/>
   </w:num>
   <w:num w:numId="12" w16cid:durableId="478427476">
-    <w:abstractNumId w:val="43"/>
+    <w:abstractNumId w:val="44"/>
   </w:num>
   <w:num w:numId="13" w16cid:durableId="1639262997">
     <w:abstractNumId w:val="9"/>
@@ -5450,7 +5954,7 @@
     <w:abstractNumId w:val="21"/>
   </w:num>
   <w:num w:numId="27" w16cid:durableId="1344552876">
-    <w:abstractNumId w:val="41"/>
+    <w:abstractNumId w:val="42"/>
   </w:num>
   <w:num w:numId="28" w16cid:durableId="1306927874">
     <w:abstractNumId w:val="18"/>
@@ -5471,16 +5975,16 @@
     <w:abstractNumId w:val="14"/>
   </w:num>
   <w:num w:numId="34" w16cid:durableId="2137018705">
-    <w:abstractNumId w:val="39"/>
+    <w:abstractNumId w:val="40"/>
   </w:num>
   <w:num w:numId="35" w16cid:durableId="771125831">
-    <w:abstractNumId w:val="38"/>
+    <w:abstractNumId w:val="39"/>
   </w:num>
   <w:num w:numId="36" w16cid:durableId="855651585">
     <w:abstractNumId w:val="25"/>
   </w:num>
   <w:num w:numId="37" w16cid:durableId="1498618643">
-    <w:abstractNumId w:val="40"/>
+    <w:abstractNumId w:val="41"/>
   </w:num>
   <w:num w:numId="38" w16cid:durableId="32779079">
     <w:abstractNumId w:val="13"/>
@@ -5495,7 +5999,7 @@
     <w:abstractNumId w:val="22"/>
   </w:num>
   <w:num w:numId="42" w16cid:durableId="1829781489">
-    <w:abstractNumId w:val="42"/>
+    <w:abstractNumId w:val="43"/>
   </w:num>
   <w:num w:numId="43" w16cid:durableId="498159078">
     <w:abstractNumId w:val="34"/>
@@ -5504,13 +6008,16 @@
     <w:abstractNumId w:val="19"/>
   </w:num>
   <w:num w:numId="45" w16cid:durableId="421608136">
-    <w:abstractNumId w:val="46"/>
+    <w:abstractNumId w:val="47"/>
   </w:num>
   <w:num w:numId="46" w16cid:durableId="1323697169">
     <w:abstractNumId w:val="29"/>
   </w:num>
   <w:num w:numId="47" w16cid:durableId="2096121858">
     <w:abstractNumId w:val="28"/>
+  </w:num>
+  <w:num w:numId="48" w16cid:durableId="2064135069">
+    <w:abstractNumId w:val="37"/>
   </w:num>
   <w:numIdMacAtCleanup w:val="12"/>
 </w:numbering>
@@ -6015,7 +6522,6 @@
   <w:style w:type="character" w:default="1" w:styleId="DefaultParagraphFont">
     <w:name w:val="Default Paragraph Font"/>
     <w:uiPriority w:val="1"/>
-    <w:semiHidden/>
     <w:unhideWhenUsed/>
   </w:style>
   <w:style w:type="table" w:default="1" w:styleId="TableNormal">

</xml_diff>